<commit_message>
renamed HTML and updated QR Code
</commit_message>
<xml_diff>
--- a/Scavenger Hunt.docx
+++ b/Scavenger Hunt.docx
@@ -290,10 +290,10 @@
       </w:pPr>
       <w:r>
         <w:drawing>
-          <wp:inline distT="0" distB="0" distL="0" distR="0" wp14:anchorId="2CBD8603" wp14:editId="11AE6B88">
-            <wp:extent cx="2199973" cy="2169160"/>
-            <wp:effectExtent l="0" t="0" r="0" b="2540"/>
-            <wp:docPr id="1497251227" name="Picture 1" descr="The image is a QR code with a black and white pattern.&#10;&#10;AI-generated content may be incorrect."/>
+          <wp:inline distT="0" distB="0" distL="0" distR="0" wp14:anchorId="5F480181" wp14:editId="7973984A">
+            <wp:extent cx="1668322" cy="2157046"/>
+            <wp:effectExtent l="0" t="0" r="8255" b="0"/>
+            <wp:docPr id="1882688999" name="Picture 2" descr="The image depicts a QR code with a black border, a white background, and a black square at the center, containing a black square and a white QR code symbol.&#10;&#10;AI-generated content may be incorrect."/>
             <wp:cNvGraphicFramePr>
               <a:graphicFrameLocks xmlns:a="http://schemas.openxmlformats.org/drawingml/2006/main" noChangeAspect="1"/>
             </wp:cNvGraphicFramePr>
@@ -301,23 +301,36 @@
               <a:graphicData uri="http://schemas.openxmlformats.org/drawingml/2006/picture">
                 <pic:pic xmlns:pic="http://schemas.openxmlformats.org/drawingml/2006/picture">
                   <pic:nvPicPr>
-                    <pic:cNvPr id="1497251227" name="Picture 1" descr="The image is a QR code with a black and white pattern.&#10;&#10;AI-generated content may be incorrect."/>
-                    <pic:cNvPicPr/>
+                    <pic:cNvPr id="1882688999" name="Picture 2" descr="The image depicts a QR code with a black border, a white background, and a black square at the center, containing a black square and a white QR code symbol.&#10;&#10;AI-generated content may be incorrect."/>
+                    <pic:cNvPicPr>
+                      <a:picLocks noChangeAspect="1" noChangeArrowheads="1"/>
+                    </pic:cNvPicPr>
                   </pic:nvPicPr>
                   <pic:blipFill>
-                    <a:blip r:embed="rId5"/>
+                    <a:blip r:embed="rId5" cstate="print">
+                      <a:extLst>
+                        <a:ext uri="{28A0092B-C50C-407E-A947-70E740481C1C}">
+                          <a14:useLocalDpi xmlns:a14="http://schemas.microsoft.com/office/drawing/2010/main" val="0"/>
+                        </a:ext>
+                      </a:extLst>
+                    </a:blip>
+                    <a:srcRect/>
                     <a:stretch>
                       <a:fillRect/>
                     </a:stretch>
                   </pic:blipFill>
-                  <pic:spPr>
+                  <pic:spPr bwMode="auto">
                     <a:xfrm>
                       <a:off x="0" y="0"/>
-                      <a:ext cx="2206927" cy="2176017"/>
+                      <a:ext cx="1683430" cy="2176579"/>
                     </a:xfrm>
                     <a:prstGeom prst="rect">
                       <a:avLst/>
                     </a:prstGeom>
+                    <a:noFill/>
+                    <a:ln>
+                      <a:noFill/>
+                    </a:ln>
                   </pic:spPr>
                 </pic:pic>
               </a:graphicData>
@@ -325,6 +338,11 @@
           </wp:inline>
         </w:drawing>
       </w:r>
+    </w:p>
+    <w:p>
+      <w:pPr>
+        <w:jc w:val="center"/>
+      </w:pPr>
     </w:p>
     <w:p>
       <w:pPr>
@@ -1271,7 +1289,6 @@
   <w:style w:type="character" w:default="1" w:styleId="DefaultParagraphFont">
     <w:name w:val="Default Paragraph Font"/>
     <w:uiPriority w:val="1"/>
-    <w:semiHidden/>
     <w:unhideWhenUsed/>
   </w:style>
   <w:style w:type="table" w:default="1" w:styleId="TableNormal">

</xml_diff>